<commit_message>
Drop Panthers parenthetical and AEI Board label
Co-Authored-By: Claude Opus 4.8 <noreply@anthropic.com>
</commit_message>
<xml_diff>
--- a/assets/Uday_Barooah_Sport_Resume.docx
+++ b/assets/Uday_Barooah_Sport_Resume.docx
@@ -54,7 +54,7 @@
         </w:rPr>
         <w:t xml:space="preserve">   |   </w:t>
       </w:r>
-      <w:hyperlink w:history="1" r:id="rIdmbxee2jzihnfh-dfipr-a">
+      <w:hyperlink w:history="1" r:id="rIdkycuejudc0pw6lcsdo5ch">
         <w:r>
           <w:rPr>
             <w:color w:val="13524B"/>
@@ -88,7 +88,7 @@
         </w:rPr>
         <w:t xml:space="preserve">   |   </w:t>
       </w:r>
-      <w:hyperlink w:history="1" r:id="rIdkkyz1dldllhd4eoyv-dys">
+      <w:hyperlink w:history="1" r:id="rIduqdxt5mhmt0q4t7yc4htk">
         <w:r>
           <w:rPr>
             <w:color w:val="13524B"/>
@@ -992,7 +992,7 @@
           <w:sz w:val="20"/>
           <w:szCs w:val="20"/>
         </w:rPr>
-        <w:t xml:space="preserve">Director (Board)</w:t>
+        <w:t xml:space="preserve">Director</w:t>
       </w:r>
     </w:p>
     <w:p>
@@ -1042,7 +1042,7 @@
         </w:rPr>
         <w:t xml:space="preserve">Build automated athlete-monitoring and reporting systems that integrate Catapult, VALD and wellness data using R and Python, run live GPS monitoring, and create custom dashboards. Increasingly applying AI tooling (Claude Code) to automate performance reporting. Deidentified portfolio: </w:t>
       </w:r>
-      <w:hyperlink w:history="1" r:id="rIdb6cxt7js5jy1ygyv89oo_">
+      <w:hyperlink w:history="1" r:id="rIdjxvyyouluv4soth-xrl74">
         <w:r>
           <w:rPr>
             <w:color w:val="13524B"/>

</xml_diff>